<commit_message>
Add Avtalsform and Närvarande fields to slutbesiktning/skadeutredning
Both are visible in the real reference reports but weren't captured by
the app's form. No schema migration needed — both live in Report.dataJson
per the existing type-specific-fields convention:

- Avtalsform (slutbesiktning only, e.g. "Konsumenttjänster")
- Närvarande — attendee names, beställare + hantverkare sides on
  slutbesiktning, beställare side only on skadeutredning (matches its
  reference; statusbesiktning already had this via lagenhetsinnehavare)

Parter tab, template-data.ts, build-templates.ts, smoke fixtures, and
PLACEHOLDERS.md all updated together. Verified via the unzipped
smoke-generated .docx: both new sections render with zero unresolved
tags. Build + lint + smoke:generate clean.

Co-Authored-By: Claude Opus 4.8 <noreply@anthropic.com>
Claude-Session: https://claude.ai/code/session_01Swqxs5F9cCYjHvhq9SJ1yw
</commit_message>
<xml_diff>
--- a/templates/skadeutredning.docx
+++ b/templates/skadeutredning.docx
@@ -330,6 +330,79 @@
           <w:p>
             <w:r>
               <w:t xml:space="preserve">{besiktningsman_namn} — utsedd av beställaren</w:t>
+            </w:r>
+          </w:p>
+        </w:tc>
+      </w:tr>
+    </w:tbl>
+    <w:p>
+      <w:pPr>
+        <w:spacing w:after="80" w:before="280"/>
+      </w:pPr>
+      <w:r>
+        <w:rPr>
+          <w:b/>
+          <w:bCs/>
+          <w:color w:val="1A1A1A"/>
+          <w:sz w:val="24"/>
+          <w:szCs w:val="24"/>
+        </w:rPr>
+        <w:t xml:space="preserve">Närvarande</w:t>
+      </w:r>
+    </w:p>
+    <w:p>
+      <w:r>
+        <w:t xml:space="preserve">Vid besiktningen var parterna representerade av:</w:t>
+      </w:r>
+    </w:p>
+    <w:tbl>
+      <w:tblPr>
+        <w:tblW w:type="pct" w:w="100%"/>
+        <w:tblBorders>
+          <w:top w:val="none" w:color="auto" w:sz="0"/>
+          <w:left w:val="none" w:color="auto" w:sz="0"/>
+          <w:bottom w:val="none" w:color="auto" w:sz="0"/>
+          <w:right w:val="none" w:color="auto" w:sz="0"/>
+          <w:insideH w:val="none" w:color="auto" w:sz="0"/>
+          <w:insideV w:val="none" w:color="auto" w:sz="0"/>
+        </w:tblBorders>
+      </w:tblPr>
+      <w:tblGrid>
+        <w:gridCol w:w="100"/>
+        <w:gridCol w:w="100"/>
+      </w:tblGrid>
+      <w:tr>
+        <w:tc>
+          <w:tcPr>
+            <w:tcW w:type="pct" w:w="35%"/>
+            <w:tcBorders>
+              <w:top w:val="none" w:color="auto" w:sz="0"/>
+              <w:left w:val="none" w:color="auto" w:sz="0"/>
+              <w:bottom w:val="none" w:color="auto" w:sz="0"/>
+              <w:right w:val="none" w:color="auto" w:sz="0"/>
+            </w:tcBorders>
+            <w:vAlign w:val="center"/>
+          </w:tcPr>
+          <w:p>
+            <w:r>
+              <w:t xml:space="preserve">för beställaren:</w:t>
+            </w:r>
+          </w:p>
+        </w:tc>
+        <w:tc>
+          <w:tcPr>
+            <w:tcW w:type="pct" w:w="65%"/>
+            <w:tcBorders>
+              <w:top w:val="none" w:color="auto" w:sz="0"/>
+              <w:left w:val="none" w:color="auto" w:sz="0"/>
+              <w:bottom w:val="none" w:color="auto" w:sz="0"/>
+              <w:right w:val="none" w:color="auto" w:sz="0"/>
+            </w:tcBorders>
+            <w:vAlign w:val="center"/>
+          </w:tcPr>
+          <w:p>
+            <w:r>
+              <w:t xml:space="preserve">{narvarande_bestallare}</w:t>
             </w:r>
           </w:p>
         </w:tc>

</xml_diff>